<commit_message>
Update docs (GUIDE.md and Word document) with a note about existing env file
</commit_message>
<xml_diff>
--- a/HUONG_DAN_CAI_DAT.docx
+++ b/HUONG_DAN_CAI_DAT.docx
@@ -308,6 +308,54 @@
       <w:r>
         <w:t>Để dự án kết nối được với cơ sở dữ liệu Supabase, hãy tạo file cấu hình như sau:</w:t>
       </w:r>
+    </w:p>
+    <w:tbl>
+      <w:tblPr>
+        <w:tblW w:type="auto" w:w="0"/>
+        <w:jc w:val="center"/>
+        <w:tblLook w:firstColumn="1" w:firstRow="1" w:lastColumn="0" w:lastRow="0" w:noHBand="0" w:noVBand="1" w:val="04A0"/>
+      </w:tblPr>
+      <w:tblGrid>
+        <w:gridCol w:w="9360"/>
+      </w:tblGrid>
+      <w:tr>
+        <w:tc>
+          <w:tcPr>
+            <w:tcW w:type="dxa" w:w="9360"/>
+            <w:shd w:val="clear" w:color="auto" w:fill="EBF7ED"/>
+            <w:tcMar>
+              <w:top w:w="120" w:type="dxa"/>
+              <w:bottom w:w="120" w:type="dxa"/>
+              <w:left w:w="200" w:type="dxa"/>
+              <w:right w:w="200" w:type="dxa"/>
+            </w:tcMar>
+            <w:tcBorders>
+              <w:left w:val="single" w:sz="24" w:space="0" w:color="2E7D32"/>
+              <w:top w:val="none"/>
+              <w:bottom w:val="none"/>
+              <w:right w:val="none"/>
+            </w:tcBorders>
+          </w:tcPr>
+          <w:p>
+            <w:pPr>
+              <w:spacing w:after="0"/>
+            </w:pPr>
+            <w:r>
+              <w:rPr>
+                <w:i/>
+                <w:color w:val="505A64"/>
+                <w:sz w:val="20"/>
+              </w:rPr>
+              <w:t>Lưu ý quan trọng: Nếu bạn nhận được thư mục dự án này dưới dạng file nén .zip từ chủ dự án và thấy trong thư mục "src code" đã có sẵn file ".env" (chứa sẵn các key kết nối hoạt động), bạn hãy BỎ QUA HOÀN TOÀN Bước 2 này và chuyển thẳng tới Bước 3 để chạy luôn!</w:t>
+            </w:r>
+          </w:p>
+        </w:tc>
+      </w:tr>
+    </w:tbl>
+    <w:p>
+      <w:pPr>
+        <w:spacing w:after="120"/>
+      </w:pPr>
     </w:p>
     <w:p>
       <w:pPr>

</xml_diff>

<commit_message>
Update docs and pre-fill public env configurations
</commit_message>
<xml_diff>
--- a/HUONG_DAN_CAI_DAT.docx
+++ b/HUONG_DAN_CAI_DAT.docx
@@ -435,10 +435,10 @@
         <w:rPr>
           <w:b/>
         </w:rPr>
-        <w:t xml:space="preserve">Điền thông tin từ Supabase: </w:t>
+        <w:t xml:space="preserve">Điền khóa bí mật (Secret Key) để chạy backend: </w:t>
       </w:r>
       <w:r>
-        <w:t>Vào Dashboard của Supabase dự án -&gt; chọn Project Settings -&gt; API. Copy các giá trị và dán tương ứng vào file `.env`:</w:t>
+        <w:t>File `.env.example` đã được điền sẵn các thông tin công khai (URL và Publishable key) của dự án. Bạn chỉ cần điền duy nhất khóa bí mật của database.</w:t>
       </w:r>
     </w:p>
     <w:p>
@@ -456,10 +456,10 @@
         <w:rPr>
           <w:b/>
         </w:rPr>
-        <w:t xml:space="preserve">Dòng 5 (NEXT_PUBLIC_SUPABASE_URL): </w:t>
+        <w:t xml:space="preserve">Lấy khóa: </w:t>
       </w:r>
       <w:r>
-        <w:t>Dán Project URL của bạn.</w:t>
+        <w:t>Truy cập vào trang quản trị Supabase của bạn -&gt; Chọn Project Settings -&gt; Chọn API ở cột bên trái.</w:t>
       </w:r>
     </w:p>
     <w:p>
@@ -477,10 +477,10 @@
         <w:rPr>
           <w:b/>
         </w:rPr>
-        <w:t xml:space="preserve">Dòng 6 (NEXT_PUBLIC_SUPABASE_PUBLISHABLE_KEY): </w:t>
+        <w:t xml:space="preserve">Tạo key mới: </w:t>
       </w:r>
       <w:r>
-        <w:t>Dán anon/public key của bạn.</w:t>
+        <w:t>Tại mục Secret keys, bấm nút + New secret key ở góc phải -&gt; Đặt tên bất kỳ và bấm tạo -&gt; Copy key dạng sb_secret_... vừa sinh ra.</w:t>
       </w:r>
     </w:p>
     <w:p>
@@ -498,31 +498,10 @@
         <w:rPr>
           <w:b/>
         </w:rPr>
-        <w:t xml:space="preserve">Dòng 7 (SUPABASE_URL): </w:t>
+        <w:t xml:space="preserve">Dán key: </w:t>
       </w:r>
       <w:r>
-        <w:t>Dán lại Project URL của bạn giống dòng 5.</w:t>
-      </w:r>
-    </w:p>
-    <w:p>
-      <w:pPr>
-        <w:spacing w:after="80"/>
-        <w:ind w:left="360"/>
-      </w:pPr>
-      <w:r>
-        <w:rPr>
-          <w:b/>
-        </w:rPr>
-        <w:t xml:space="preserve">   - </w:t>
-      </w:r>
-      <w:r>
-        <w:rPr>
-          <w:b/>
-        </w:rPr>
-        <w:t xml:space="preserve">Dòng 8 (SUPABASE_SERVICE_ROLE_KEY): </w:t>
-      </w:r>
-      <w:r>
-        <w:t>Bấm nút + New secret key ở mục Secret keys trên Supabase -&gt; Tạo key mới -&gt; Copy key dạng sb_secret_... vừa sinh ra và dán vào đây.</w:t>
+        <w:t>Dán key vừa copy vào sau dấu = ở Dòng 8 (SUPABASE_SERVICE_ROLE_KEY).</w:t>
       </w:r>
     </w:p>
     <w:p>

</xml_diff>

<commit_message>
Update docs to display full pre-filled .env content block
</commit_message>
<xml_diff>
--- a/HUONG_DAN_CAI_DAT.docx
+++ b/HUONG_DAN_CAI_DAT.docx
@@ -438,71 +438,96 @@
         <w:t xml:space="preserve">Điền khóa bí mật (Secret Key) để chạy backend: </w:t>
       </w:r>
       <w:r>
-        <w:t>File `.env.example` đã được điền sẵn các thông tin công khai (URL và Publishable key) của dự án. Bạn chỉ cần điền duy nhất khóa bí mật của database.</w:t>
+        <w:t>File `.env` sau khi nhân bản đã chứa sẵn các thông tin cấu hình công khai của dự án. Bạn chỉ cần dán khóa bí mật (do chủ dự án cung cấp riêng) vào sau dấu = ở Dòng 8 (SUPABASE_SERVICE_ROLE_KEY=).</w:t>
       </w:r>
     </w:p>
     <w:p>
-      <w:pPr>
-        <w:spacing w:after="80"/>
-        <w:ind w:left="360"/>
-      </w:pPr>
       <w:r>
-        <w:rPr>
-          <w:b/>
-        </w:rPr>
-        <w:t xml:space="preserve">   - </w:t>
-      </w:r>
-      <w:r>
-        <w:rPr>
-          <w:b/>
-        </w:rPr>
-        <w:t xml:space="preserve">Lấy khóa: </w:t>
-      </w:r>
-      <w:r>
-        <w:t>Truy cập vào trang quản trị Supabase của bạn -&gt; Chọn Project Settings -&gt; Chọn API ở cột bên trái.</w:t>
+        <w:t>Hoặc bạn có thể copy toàn bộ nội dung mẫu dưới đây và đè vào file `.env`:</w:t>
       </w:r>
     </w:p>
+    <w:tbl>
+      <w:tblPr>
+        <w:tblW w:type="auto" w:w="0"/>
+        <w:jc w:val="center"/>
+        <w:tblLook w:firstColumn="1" w:firstRow="1" w:lastColumn="0" w:lastRow="0" w:noHBand="0" w:noVBand="1" w:val="04A0"/>
+      </w:tblPr>
+      <w:tblGrid>
+        <w:gridCol w:w="9360"/>
+      </w:tblGrid>
+      <w:tr>
+        <w:tc>
+          <w:tcPr>
+            <w:tcW w:type="dxa" w:w="9360"/>
+            <w:shd w:val="clear" w:color="auto" w:fill="282C34"/>
+            <w:tcMar>
+              <w:top w:w="100" w:type="dxa"/>
+              <w:bottom w:w="100" w:type="dxa"/>
+              <w:left w:w="150" w:type="dxa"/>
+              <w:right w:w="150" w:type="dxa"/>
+            </w:tcMar>
+            <w:tcBorders>
+              <w:top w:val="none"/>
+              <w:left w:val="none"/>
+              <w:bottom w:val="none"/>
+              <w:right w:val="none"/>
+            </w:tcBorders>
+          </w:tcPr>
+          <w:p>
+            <w:pPr>
+              <w:spacing w:after="0"/>
+            </w:pPr>
+            <w:r>
+              <w:rPr>
+                <w:rFonts w:ascii="Consolas" w:hAnsi="Consolas"/>
+                <w:color w:val="ABB2BF"/>
+                <w:sz w:val="20"/>
+              </w:rPr>
+              <w:t># Shared / Environment</w:t>
+              <w:br/>
+              <w:t>NODE_ENV=development</w:t>
+              <w:br/>
+              <w:br/>
+              <w:t># Supabase Configurations</w:t>
+              <w:br/>
+              <w:t>NEXT_PUBLIC_SUPABASE_URL=https://tzcksukvryjhknsakbkf.supabase.co</w:t>
+              <w:br/>
+              <w:t>NEXT_PUBLIC_SUPABASE_PUBLISHABLE_KEY=sb_publishable_nYuDiW9Di2wF4-LmFhSEWQ_H_JNdZnQ</w:t>
+              <w:br/>
+              <w:t>SUPABASE_URL=https://tzcksukvryjhknsakbkf.supabase.co</w:t>
+              <w:br/>
+              <w:t>SUPABASE_SERVICE_ROLE_KEY=[DÁN_KEY_BÍ_MẬT_DO_CHỦ_DỰ_ÁN_CUNG_CẤP_VÀO_ĐÂY]</w:t>
+              <w:br/>
+              <w:t>SUPABASE_JWT_SECRET=</w:t>
+              <w:br/>
+              <w:br/>
+              <w:t># API Backend Configuration</w:t>
+              <w:br/>
+              <w:t>PORT=3001</w:t>
+              <w:br/>
+              <w:t>CORS_ALLOWED_ORIGINS=http://localhost:3000,http://localhost:3002</w:t>
+              <w:br/>
+              <w:t>BOOKINGS_LIFECYCLE_ENABLED=false</w:t>
+              <w:br/>
+              <w:t>BOOKINGS_LIFECYCLE_INTERVAL_MS=60000</w:t>
+              <w:br/>
+              <w:t>BOOKINGS_LIFECYCLE_RUN_ON_START=false</w:t>
+              <w:br/>
+              <w:br/>
+              <w:t># Web Frontend (web-final) Configuration</w:t>
+              <w:br/>
+              <w:t>NEXT_PUBLIC_API_BASE_URL=/api</w:t>
+              <w:br/>
+              <w:t>API_PROXY_TARGET=http://127.0.0.1:3001</w:t>
+            </w:r>
+          </w:p>
+        </w:tc>
+      </w:tr>
+    </w:tbl>
     <w:p>
       <w:pPr>
-        <w:spacing w:after="80"/>
-        <w:ind w:left="360"/>
+        <w:spacing w:after="120"/>
       </w:pPr>
-      <w:r>
-        <w:rPr>
-          <w:b/>
-        </w:rPr>
-        <w:t xml:space="preserve">   - </w:t>
-      </w:r>
-      <w:r>
-        <w:rPr>
-          <w:b/>
-        </w:rPr>
-        <w:t xml:space="preserve">Tạo key mới: </w:t>
-      </w:r>
-      <w:r>
-        <w:t>Tại mục Secret keys, bấm nút + New secret key ở góc phải -&gt; Đặt tên bất kỳ và bấm tạo -&gt; Copy key dạng sb_secret_... vừa sinh ra.</w:t>
-      </w:r>
-    </w:p>
-    <w:p>
-      <w:pPr>
-        <w:spacing w:after="80"/>
-        <w:ind w:left="360"/>
-      </w:pPr>
-      <w:r>
-        <w:rPr>
-          <w:b/>
-        </w:rPr>
-        <w:t xml:space="preserve">   - </w:t>
-      </w:r>
-      <w:r>
-        <w:rPr>
-          <w:b/>
-        </w:rPr>
-        <w:t xml:space="preserve">Dán key: </w:t>
-      </w:r>
-      <w:r>
-        <w:t>Dán key vừa copy vào sau dấu = ở Dòng 8 (SUPABASE_SERVICE_ROLE_KEY).</w:t>
-      </w:r>
     </w:p>
     <w:p>
       <w:pPr>

</xml_diff>

<commit_message>
Detail key copy-paste mappings in doc guide
</commit_message>
<xml_diff>
--- a/HUONG_DAN_CAI_DAT.docx
+++ b/HUONG_DAN_CAI_DAT.docx
@@ -435,10 +435,94 @@
         <w:rPr>
           <w:b/>
         </w:rPr>
-        <w:t xml:space="preserve">Điền khóa bí mật (Secret Key) để chạy backend: </w:t>
+        <w:t xml:space="preserve">Điền thông tin cấu hình Supabase: </w:t>
       </w:r>
       <w:r>
-        <w:t>File `.env` sau khi nhân bản đã chứa sẵn các thông tin cấu hình công khai của dự án. Bạn chỉ cần dán khóa bí mật (do chủ dự án cung cấp riêng) vào sau dấu = ở Dòng 8 (SUPABASE_SERVICE_ROLE_KEY=).</w:t>
+        <w:t>Hãy sao chép các thông tin dưới đây và dán vào sau dấu = của các dòng tương ứng trong file `.env`:</w:t>
+      </w:r>
+    </w:p>
+    <w:p>
+      <w:pPr>
+        <w:spacing w:after="80"/>
+        <w:ind w:left="360"/>
+      </w:pPr>
+      <w:r>
+        <w:rPr>
+          <w:b/>
+        </w:rPr>
+        <w:t xml:space="preserve">   - </w:t>
+      </w:r>
+      <w:r>
+        <w:rPr>
+          <w:b/>
+        </w:rPr>
+        <w:t xml:space="preserve">Dòng 5 (NEXT_PUBLIC_SUPABASE_URL): </w:t>
+      </w:r>
+      <w:r>
+        <w:t>https://tzcksukvryjhknsakbkf.supabase.co</w:t>
+      </w:r>
+    </w:p>
+    <w:p>
+      <w:pPr>
+        <w:spacing w:after="80"/>
+        <w:ind w:left="360"/>
+      </w:pPr>
+      <w:r>
+        <w:rPr>
+          <w:b/>
+        </w:rPr>
+        <w:t xml:space="preserve">   - </w:t>
+      </w:r>
+      <w:r>
+        <w:rPr>
+          <w:b/>
+        </w:rPr>
+        <w:t xml:space="preserve">Dòng 6 (NEXT_PUBLIC_SUPABASE_PUBLISHABLE_KEY): </w:t>
+      </w:r>
+      <w:r>
+        <w:t>sb_publishable_nYuDiW9Di2wF4-LmFhSEWQ_H_JNdZnQ</w:t>
+      </w:r>
+    </w:p>
+    <w:p>
+      <w:pPr>
+        <w:spacing w:after="80"/>
+        <w:ind w:left="360"/>
+      </w:pPr>
+      <w:r>
+        <w:rPr>
+          <w:b/>
+        </w:rPr>
+        <w:t xml:space="preserve">   - </w:t>
+      </w:r>
+      <w:r>
+        <w:rPr>
+          <w:b/>
+        </w:rPr>
+        <w:t xml:space="preserve">Dòng 7 (SUPABASE_URL): </w:t>
+      </w:r>
+      <w:r>
+        <w:t>https://tzcksukvryjhknsakbkf.supabase.co</w:t>
+      </w:r>
+    </w:p>
+    <w:p>
+      <w:pPr>
+        <w:spacing w:after="80"/>
+        <w:ind w:left="360"/>
+      </w:pPr>
+      <w:r>
+        <w:rPr>
+          <w:b/>
+        </w:rPr>
+        <w:t xml:space="preserve">   - </w:t>
+      </w:r>
+      <w:r>
+        <w:rPr>
+          <w:b/>
+        </w:rPr>
+        <w:t xml:space="preserve">Dòng 8 (SUPABASE_SERVICE_ROLE_KEY): </w:t>
+      </w:r>
+      <w:r>
+        <w:t>Dán khóa bí mật (service_role key) mới của bạn vào (Lấy từ trang quản trị Supabase -&gt; Project Settings -&gt; API -&gt; Secret keys -&gt; bấm tạo khóa mới và copy).</w:t>
       </w:r>
     </w:p>
     <w:p>

</xml_diff>